<commit_message>
AL-202 update ibrahima's files now that #98 is merged and the stories are sorted for sprint 1
</commit_message>
<xml_diff>
--- a/docs/sprint-1-submission/ibrahima/AL-194-heloc.docx
+++ b/docs/sprint-1-submission/ibrahima/AL-194-heloc.docx
@@ -773,7 +773,7 @@
               <w:rPr>
                 <w:sz w:val="19"/>
               </w:rPr>
-              <w:t>Sprint 1</w:t>
+              <w:t>Sprint 1 to 2</w:t>
             </w:r>
           </w:p>
         </w:tc>
@@ -786,7 +786,7 @@
               <w:rPr>
                 <w:sz w:val="19"/>
               </w:rPr>
-              <w:t>In Progress: wireframes done, choice merged (PR #62), check and application moved to Sprint 2</w:t>
+              <w:t>In Progress: wireframes done and choice merged (PR #62) in Sprint 1; story moved to Sprint 2 for the check and application</w:t>
             </w:r>
           </w:p>
         </w:tc>

</xml_diff>